<commit_message>
Revamp C817 to Google's official Gemini in Sheets guide: 12 HR labs, prompts page (v2.0)
- Three topics: Fundamentals of Google Sheet; Data Analytics and Visualization;
  Interactive Dashboard, following "Collaborate with Gemini in Google Sheets"
  and the AI function guide
- Twelve connected labs on a fictional HR firm's hiring drive (Orchid Bay
  Talent Partners), each in its own folder with mock data, an instruction PDF
  and sample prompts
- Copy-ready Lab Prompts page (docs/prompts) laid out step -> prompt
- Deck in the C34 house design with official Google screenshots, credited
- Lesson Plan and Learner Guide v2.0; Learner Guide Markdown mirror removed
- Build pipeline ported from C34: mock data, lab PDFs, prompts page
- Superseded v1.1 deck and lab Markdown files removed from the repo

Co-Authored-By: Claude Opus 5.5 <noreply@anthropic.com>
</commit_message>
<xml_diff>
--- a/courseware/LP-Gemini for Google Sheet (C817).docx
+++ b/courseware/LP-Gemini for Google Sheet (C817).docx
@@ -109,7 +109,7 @@
           <w:color w:val="111827"/>
           <w:sz w:val="40"/>
         </w:rPr>
-        <w:t>Gemini for Google Sheet (C817)</w:t>
+        <w:t>Gemini for Google Sheet</w:t>
       </w:r>
     </w:p>
     <w:p>
@@ -179,7 +179,7 @@
           <w:color w:val="1F6FEB"/>
           <w:sz w:val="24"/>
         </w:rPr>
-        <w:t>Version 1.1</w:t>
+        <w:t>Version 2.0</w:t>
       </w:r>
     </w:p>
     <w:p>
@@ -205,18 +205,19 @@
         <w:tblStyle w:val="TableGrid"/>
         <w:tblW w:type="auto" w:w="0"/>
         <w:jc w:val="center"/>
+        <w:tblLayout w:type="fixed"/>
         <w:tblLook w:firstColumn="1" w:firstRow="1" w:lastColumn="0" w:lastRow="0" w:noHBand="0" w:noVBand="1" w:val="04A0"/>
       </w:tblPr>
       <w:tblGrid>
-        <w:gridCol w:w="2160"/>
-        <w:gridCol w:w="2160"/>
-        <w:gridCol w:w="2160"/>
-        <w:gridCol w:w="2160"/>
+        <w:gridCol w:w="1152"/>
+        <w:gridCol w:w="1656"/>
+        <w:gridCol w:w="4896"/>
+        <w:gridCol w:w="1656"/>
       </w:tblGrid>
       <w:tr>
         <w:tc>
           <w:tcPr>
-            <w:tcW w:type="dxa" w:w="2160"/>
+            <w:tcW w:type="dxa" w:w="1152"/>
             <w:shd w:val="clear" w:color="auto" w:fill="1F6FEB"/>
           </w:tcPr>
           <w:p>
@@ -233,7 +234,7 @@
         </w:tc>
         <w:tc>
           <w:tcPr>
-            <w:tcW w:type="dxa" w:w="2160"/>
+            <w:tcW w:type="dxa" w:w="1656"/>
             <w:shd w:val="clear" w:color="auto" w:fill="1F6FEB"/>
           </w:tcPr>
           <w:p>
@@ -250,7 +251,7 @@
         </w:tc>
         <w:tc>
           <w:tcPr>
-            <w:tcW w:type="dxa" w:w="2160"/>
+            <w:tcW w:type="dxa" w:w="4896"/>
             <w:shd w:val="clear" w:color="auto" w:fill="1F6FEB"/>
           </w:tcPr>
           <w:p>
@@ -267,7 +268,7 @@
         </w:tc>
         <w:tc>
           <w:tcPr>
-            <w:tcW w:type="dxa" w:w="2160"/>
+            <w:tcW w:type="dxa" w:w="1656"/>
             <w:shd w:val="clear" w:color="auto" w:fill="1F6FEB"/>
           </w:tcPr>
           <w:p>
@@ -286,7 +287,7 @@
       <w:tr>
         <w:tc>
           <w:tcPr>
-            <w:tcW w:type="dxa" w:w="2160"/>
+            <w:tcW w:type="dxa" w:w="1152"/>
           </w:tcPr>
           <w:p>
             <w:r/>
@@ -300,7 +301,7 @@
         </w:tc>
         <w:tc>
           <w:tcPr>
-            <w:tcW w:type="dxa" w:w="2160"/>
+            <w:tcW w:type="dxa" w:w="1656"/>
           </w:tcPr>
           <w:p>
             <w:r/>
@@ -314,7 +315,7 @@
         </w:tc>
         <w:tc>
           <w:tcPr>
-            <w:tcW w:type="dxa" w:w="2160"/>
+            <w:tcW w:type="dxa" w:w="4896"/>
           </w:tcPr>
           <w:p>
             <w:r/>
@@ -322,13 +323,13 @@
               <w:rPr>
                 <w:sz w:val="19"/>
               </w:rPr>
-              <w:t>Initial release — C817 AI Application for Google Sheet courseware.</w:t>
+              <w:t>Initial release - C817 AI Application for Google Sheet courseware.</w:t>
             </w:r>
           </w:p>
         </w:tc>
         <w:tc>
           <w:tcPr>
-            <w:tcW w:type="dxa" w:w="2160"/>
+            <w:tcW w:type="dxa" w:w="1656"/>
           </w:tcPr>
           <w:p>
             <w:r/>
@@ -344,7 +345,7 @@
       <w:tr>
         <w:tc>
           <w:tcPr>
-            <w:tcW w:type="dxa" w:w="2160"/>
+            <w:tcW w:type="dxa" w:w="1152"/>
           </w:tcPr>
           <w:p>
             <w:r/>
@@ -358,7 +359,7 @@
         </w:tc>
         <w:tc>
           <w:tcPr>
-            <w:tcW w:type="dxa" w:w="2160"/>
+            <w:tcW w:type="dxa" w:w="1656"/>
           </w:tcPr>
           <w:p>
             <w:r/>
@@ -372,7 +373,7 @@
         </w:tc>
         <w:tc>
           <w:tcPr>
-            <w:tcW w:type="dxa" w:w="2160"/>
+            <w:tcW w:type="dxa" w:w="4896"/>
           </w:tcPr>
           <w:p>
             <w:r/>
@@ -386,7 +387,65 @@
         </w:tc>
         <w:tc>
           <w:tcPr>
-            <w:tcW w:type="dxa" w:w="2160"/>
+            <w:tcW w:type="dxa" w:w="1656"/>
+          </w:tcPr>
+          <w:p>
+            <w:r/>
+            <w:r>
+              <w:rPr>
+                <w:sz w:val="19"/>
+              </w:rPr>
+              <w:t>Dr. Alfred Ang</w:t>
+            </w:r>
+          </w:p>
+        </w:tc>
+      </w:tr>
+      <w:tr>
+        <w:tc>
+          <w:tcPr>
+            <w:tcW w:type="dxa" w:w="1152"/>
+          </w:tcPr>
+          <w:p>
+            <w:r/>
+            <w:r>
+              <w:rPr>
+                <w:sz w:val="19"/>
+              </w:rPr>
+              <w:t>2.0</w:t>
+            </w:r>
+          </w:p>
+        </w:tc>
+        <w:tc>
+          <w:tcPr>
+            <w:tcW w:type="dxa" w:w="1656"/>
+          </w:tcPr>
+          <w:p>
+            <w:r/>
+            <w:r>
+              <w:rPr>
+                <w:sz w:val="19"/>
+              </w:rPr>
+              <w:t>19 October 2026</w:t>
+            </w:r>
+          </w:p>
+        </w:tc>
+        <w:tc>
+          <w:tcPr>
+            <w:tcW w:type="dxa" w:w="4896"/>
+          </w:tcPr>
+          <w:p>
+            <w:r/>
+            <w:r>
+              <w:rPr>
+                <w:sz w:val="19"/>
+              </w:rPr>
+              <w:t>Revamped to follow Google's official 'Collaborate with Gemini in Google Sheets' guide and the AI function guide: three topics (Fundamentals of Google Sheet; Data Analytics and Visualization; Interactive Dashboard); twelve connected labs on a fictional HR firm's hiring drive, each in its own folder with mock data and an instruction PDF; copy-ready Lab Prompts web page; official screenshots; new content on actions, Fix, the AI function, Fill with Gemini, pivot tables, linked charts, interactive dashboards, Gems and the optimisation solver.</w:t>
+            </w:r>
+          </w:p>
+        </w:tc>
+        <w:tc>
+          <w:tcPr>
+            <w:tcW w:type="dxa" w:w="1656"/>
           </w:tcPr>
           <w:p>
             <w:r/>
@@ -509,7 +568,7 @@
           <w:color w:val="333333"/>
           <w:sz w:val="21"/>
         </w:rPr>
-        <w:t>Day 1 — Getting started with Gemini AI in Google Sheets, then analysing and visualising real data with AI</w:t>
+        <w:t>Day 1 — Fundamentals of Google Sheet, data analytics and visualization, and an interactive hiring dashboard with Gemini on HR data</w:t>
         <w:tab/>
         <w:t>4</w:t>
       </w:r>
@@ -541,6 +600,7 @@
     <w:p>
       <w:pPr>
         <w:pStyle w:val="Heading1"/>
+        <w:keepNext/>
       </w:pPr>
       <w:r>
         <w:t>Course Information</w:t>
@@ -550,16 +610,20 @@
       <w:tblPr>
         <w:tblStyle w:val="TableGrid"/>
         <w:tblW w:type="auto" w:w="0"/>
+        <w:tblLayout w:type="fixed"/>
         <w:tblLook w:firstColumn="1" w:firstRow="1" w:lastColumn="0" w:lastRow="0" w:noHBand="0" w:noVBand="1" w:val="04A0"/>
       </w:tblPr>
       <w:tblGrid>
-        <w:gridCol w:w="4320"/>
-        <w:gridCol w:w="4320"/>
+        <w:gridCol w:w="2448"/>
+        <w:gridCol w:w="6912"/>
       </w:tblGrid>
       <w:tr>
+        <w:trPr>
+          <w:cantSplit/>
+        </w:trPr>
         <w:tc>
           <w:tcPr>
-            <w:tcW w:type="dxa" w:w="4320"/>
+            <w:tcW w:type="dxa" w:w="2448"/>
             <w:shd w:val="clear" w:color="auto" w:fill="E8F0FE"/>
           </w:tcPr>
           <w:p>
@@ -575,7 +639,7 @@
         </w:tc>
         <w:tc>
           <w:tcPr>
-            <w:tcW w:type="dxa" w:w="4320"/>
+            <w:tcW w:type="dxa" w:w="6912"/>
           </w:tcPr>
           <w:p>
             <w:r/>
@@ -583,15 +647,18 @@
               <w:rPr>
                 <w:sz w:val="20"/>
               </w:rPr>
-              <w:t>Gemini for Google Sheet (C817)</w:t>
+              <w:t>Gemini for Google Sheet</w:t>
             </w:r>
           </w:p>
         </w:tc>
       </w:tr>
       <w:tr>
+        <w:trPr>
+          <w:cantSplit/>
+        </w:trPr>
         <w:tc>
           <w:tcPr>
-            <w:tcW w:type="dxa" w:w="4320"/>
+            <w:tcW w:type="dxa" w:w="2448"/>
             <w:shd w:val="clear" w:color="auto" w:fill="E8F0FE"/>
           </w:tcPr>
           <w:p>
@@ -607,7 +674,7 @@
         </w:tc>
         <w:tc>
           <w:tcPr>
-            <w:tcW w:type="dxa" w:w="4320"/>
+            <w:tcW w:type="dxa" w:w="6912"/>
           </w:tcPr>
           <w:p>
             <w:r/>
@@ -621,9 +688,12 @@
         </w:tc>
       </w:tr>
       <w:tr>
+        <w:trPr>
+          <w:cantSplit/>
+        </w:trPr>
         <w:tc>
           <w:tcPr>
-            <w:tcW w:type="dxa" w:w="4320"/>
+            <w:tcW w:type="dxa" w:w="2448"/>
             <w:shd w:val="clear" w:color="auto" w:fill="E8F0FE"/>
           </w:tcPr>
           <w:p>
@@ -639,7 +709,7 @@
         </w:tc>
         <w:tc>
           <w:tcPr>
-            <w:tcW w:type="dxa" w:w="4320"/>
+            <w:tcW w:type="dxa" w:w="6912"/>
           </w:tcPr>
           <w:p>
             <w:r/>
@@ -653,9 +723,12 @@
         </w:tc>
       </w:tr>
       <w:tr>
+        <w:trPr>
+          <w:cantSplit/>
+        </w:trPr>
         <w:tc>
           <w:tcPr>
-            <w:tcW w:type="dxa" w:w="4320"/>
+            <w:tcW w:type="dxa" w:w="2448"/>
             <w:shd w:val="clear" w:color="auto" w:fill="E8F0FE"/>
           </w:tcPr>
           <w:p>
@@ -671,7 +744,7 @@
         </w:tc>
         <w:tc>
           <w:tcPr>
-            <w:tcW w:type="dxa" w:w="4320"/>
+            <w:tcW w:type="dxa" w:w="6912"/>
           </w:tcPr>
           <w:p>
             <w:r/>
@@ -679,15 +752,18 @@
               <w:rPr>
                 <w:sz w:val="20"/>
               </w:rPr>
-              <w:t>1 day · 7.5 instructional hours per day (7.5 hours)</w:t>
+              <w:t>1 day · 7.5 instructional hours (8 scheduled hours excluding lunch, including tea breaks)</w:t>
             </w:r>
           </w:p>
         </w:tc>
       </w:tr>
       <w:tr>
+        <w:trPr>
+          <w:cantSplit/>
+        </w:trPr>
         <w:tc>
           <w:tcPr>
-            <w:tcW w:type="dxa" w:w="4320"/>
+            <w:tcW w:type="dxa" w:w="2448"/>
             <w:shd w:val="clear" w:color="auto" w:fill="E8F0FE"/>
           </w:tcPr>
           <w:p>
@@ -703,7 +779,7 @@
         </w:tc>
         <w:tc>
           <w:tcPr>
-            <w:tcW w:type="dxa" w:w="4320"/>
+            <w:tcW w:type="dxa" w:w="6912"/>
           </w:tcPr>
           <w:p>
             <w:r/>
@@ -711,15 +787,18 @@
               <w:rPr>
                 <w:sz w:val="20"/>
               </w:rPr>
-              <w:t>9:30 am – 6:30 pm (1-hour lunch; tea breaks within training time)</w:t>
+              <w:t>9:30 am - 6:30 pm (1-hour lunch; two 15-minute tea breaks; 7.5 instructional hours)</w:t>
             </w:r>
           </w:p>
         </w:tc>
       </w:tr>
       <w:tr>
+        <w:trPr>
+          <w:cantSplit/>
+        </w:trPr>
         <w:tc>
           <w:tcPr>
-            <w:tcW w:type="dxa" w:w="4320"/>
+            <w:tcW w:type="dxa" w:w="2448"/>
             <w:shd w:val="clear" w:color="auto" w:fill="E8F0FE"/>
           </w:tcPr>
           <w:p>
@@ -735,7 +814,7 @@
         </w:tc>
         <w:tc>
           <w:tcPr>
-            <w:tcW w:type="dxa" w:w="4320"/>
+            <w:tcW w:type="dxa" w:w="6912"/>
           </w:tcPr>
           <w:p>
             <w:r/>
@@ -749,9 +828,12 @@
         </w:tc>
       </w:tr>
       <w:tr>
+        <w:trPr>
+          <w:cantSplit/>
+        </w:trPr>
         <w:tc>
           <w:tcPr>
-            <w:tcW w:type="dxa" w:w="4320"/>
+            <w:tcW w:type="dxa" w:w="2448"/>
             <w:shd w:val="clear" w:color="auto" w:fill="E8F0FE"/>
           </w:tcPr>
           <w:p>
@@ -767,7 +849,7 @@
         </w:tc>
         <w:tc>
           <w:tcPr>
-            <w:tcW w:type="dxa" w:w="4320"/>
+            <w:tcW w:type="dxa" w:w="6912"/>
           </w:tcPr>
           <w:p>
             <w:r/>
@@ -784,6 +866,7 @@
     <w:p>
       <w:pPr>
         <w:pStyle w:val="Heading1"/>
+        <w:keepNext/>
       </w:pPr>
       <w:r>
         <w:t>Learning Outcomes</w:t>
@@ -802,7 +885,7 @@
         <w:rPr>
           <w:sz w:val="21"/>
         </w:rPr>
-        <w:t>LO1: Explain what generative AI and Gemini in Google Sheets are, and set up and access AI features inside a sheet.</w:t>
+        <w:t>LO1: Use Gemini in Google Sheets - the side panel, actions and formula help - to summarise, quality-check and prepare HR data, and to generate, explain and fix formulas such as VLOOKUP, COUNTIF and nested IF.</w:t>
       </w:r>
     </w:p>
     <w:p>
@@ -813,7 +896,7 @@
         <w:rPr>
           <w:sz w:val="21"/>
         </w:rPr>
-        <w:t>LO2: Generate spreadsheet formulas with AI and use AI to explain, step by step, what a formula does.</w:t>
+        <w:t>LO2: Create colour-coded tables, trackers and dropdowns, extract and categorise text with the AI function, and generate data analysis, insights, pivot tables and charts with Gemini, verifying every result.</w:t>
       </w:r>
     </w:p>
     <w:p>
@@ -824,56 +907,13 @@
         <w:rPr>
           <w:sz w:val="21"/>
         </w:rPr>
-        <w:t>LO3: Write clear, effective prompts that get accurate results for spreadsheet tasks.</w:t>
-      </w:r>
-    </w:p>
-    <w:p>
-      <w:pPr>
-        <w:pStyle w:val="ListBullet"/>
-      </w:pPr>
-      <w:r>
-        <w:rPr>
-          <w:sz w:val="21"/>
-        </w:rPr>
-        <w:t>LO4: Use AI to clean, transform and organise messy spreadsheet data into a usable table.</w:t>
-      </w:r>
-    </w:p>
-    <w:p>
-      <w:pPr>
-        <w:pStyle w:val="ListBullet"/>
-      </w:pPr>
-      <w:r>
-        <w:rPr>
-          <w:sz w:val="21"/>
-        </w:rPr>
-        <w:t>LO5: Summarise and analyse datasets with AI to surface useful, decision-ready insights.</w:t>
-      </w:r>
-    </w:p>
-    <w:p>
-      <w:pPr>
-        <w:pStyle w:val="ListBullet"/>
-      </w:pPr>
-      <w:r>
-        <w:rPr>
-          <w:sz w:val="21"/>
-        </w:rPr>
-        <w:t>LO6: Create tables, charts and visualisations from your data using AI.</w:t>
-      </w:r>
-    </w:p>
-    <w:p>
-      <w:pPr>
-        <w:pStyle w:val="ListBullet"/>
-      </w:pPr>
-      <w:r>
-        <w:rPr>
-          <w:sz w:val="21"/>
-        </w:rPr>
-        <w:t>LO7: Validate AI output for accuracy and apply AI safely and responsibly to real work data.</w:t>
+        <w:t>LO3: Build an interactive hiring dashboard, automate repeat screening with a custom Gem, and use Gemini's optimisation solver, reporting and sharing features responsibly.</w:t>
       </w:r>
     </w:p>
     <w:p>
       <w:pPr>
         <w:pStyle w:val="Heading1"/>
+        <w:keepNext/>
       </w:pPr>
       <w:r>
         <w:t>Learning Reinforcement</w:t>
@@ -926,6 +966,7 @@
     <w:p>
       <w:pPr>
         <w:pStyle w:val="Heading1"/>
+        <w:keepNext/>
       </w:pPr>
       <w:r>
         <w:t>Course Schedule</w:t>
@@ -934,9 +975,10 @@
     <w:p>
       <w:pPr>
         <w:pStyle w:val="Heading2"/>
+        <w:keepNext/>
       </w:pPr>
       <w:r>
-        <w:t>Day 1 — Getting started with Gemini AI in Google Sheets, then analysing and visualising real data with AI</w:t>
+        <w:t>Day 1 — Fundamentals of Google Sheet, data analytics and visualization, and an interactive hiring dashboard with Gemini on HR data</w:t>
       </w:r>
     </w:p>
     <w:tbl>
@@ -944,17 +986,22 @@
         <w:tblStyle w:val="TableGrid"/>
         <w:tblW w:type="auto" w:w="0"/>
         <w:jc w:val="center"/>
+        <w:tblLayout w:type="fixed"/>
         <w:tblLook w:firstColumn="1" w:firstRow="1" w:lastColumn="0" w:lastRow="0" w:noHBand="0" w:noVBand="1" w:val="04A0"/>
       </w:tblPr>
       <w:tblGrid>
-        <w:gridCol w:w="2880"/>
-        <w:gridCol w:w="2880"/>
-        <w:gridCol w:w="2880"/>
+        <w:gridCol w:w="1584"/>
+        <w:gridCol w:w="1224"/>
+        <w:gridCol w:w="6552"/>
       </w:tblGrid>
       <w:tr>
+        <w:trPr>
+          <w:tblHeader w:val="true"/>
+          <w:cantSplit/>
+        </w:trPr>
         <w:tc>
           <w:tcPr>
-            <w:tcW w:type="dxa" w:w="1656"/>
+            <w:tcW w:type="dxa" w:w="1584"/>
             <w:shd w:val="clear" w:color="auto" w:fill="1F6FEB"/>
           </w:tcPr>
           <w:p>
@@ -972,7 +1019,7 @@
         </w:tc>
         <w:tc>
           <w:tcPr>
-            <w:tcW w:type="dxa" w:w="1296"/>
+            <w:tcW w:type="dxa" w:w="1224"/>
             <w:shd w:val="clear" w:color="auto" w:fill="1F6FEB"/>
           </w:tcPr>
           <w:p>
@@ -990,7 +1037,7 @@
         </w:tc>
         <w:tc>
           <w:tcPr>
-            <w:tcW w:type="dxa" w:w="6840"/>
+            <w:tcW w:type="dxa" w:w="6552"/>
             <w:shd w:val="clear" w:color="auto" w:fill="1F6FEB"/>
           </w:tcPr>
           <w:p>
@@ -1008,9 +1055,12 @@
         </w:tc>
       </w:tr>
       <w:tr>
+        <w:trPr>
+          <w:cantSplit/>
+        </w:trPr>
         <w:tc>
           <w:tcPr>
-            <w:tcW w:type="dxa" w:w="1656"/>
+            <w:tcW w:type="dxa" w:w="1584"/>
             <w:shd w:val="clear" w:color="auto" w:fill="F3F5F8"/>
           </w:tcPr>
           <w:p>
@@ -1021,13 +1071,13 @@
                 <w:b w:val="0"/>
                 <w:sz w:val="19"/>
               </w:rPr>
-              <w:t>9:30–9:50</w:t>
+              <w:t>9:30–9:45</w:t>
             </w:r>
           </w:p>
         </w:tc>
         <w:tc>
           <w:tcPr>
-            <w:tcW w:type="dxa" w:w="1296"/>
+            <w:tcW w:type="dxa" w:w="1224"/>
             <w:shd w:val="clear" w:color="auto" w:fill="F3F5F8"/>
           </w:tcPr>
           <w:p>
@@ -1038,13 +1088,13 @@
                 <w:b w:val="0"/>
                 <w:sz w:val="19"/>
               </w:rPr>
-              <w:t>20 min</w:t>
+              <w:t>15 min</w:t>
             </w:r>
           </w:p>
         </w:tc>
         <w:tc>
           <w:tcPr>
-            <w:tcW w:type="dxa" w:w="6840"/>
+            <w:tcW w:type="dxa" w:w="6552"/>
             <w:shd w:val="clear" w:color="auto" w:fill="F3F5F8"/>
           </w:tcPr>
           <w:p>
@@ -1055,15 +1105,18 @@
                 <w:b w:val="0"/>
                 <w:sz w:val="19"/>
               </w:rPr>
-              <w:t>Welcome, course introduction, ground rules, and confirming Gemini AI access in Google Sheets for the labs</w:t>
+              <w:t>Welcome, course introduction, learning outcomes, Gemini access check and the Orchid Bay scenario</w:t>
             </w:r>
           </w:p>
         </w:tc>
       </w:tr>
       <w:tr>
+        <w:trPr>
+          <w:cantSplit/>
+        </w:trPr>
         <w:tc>
           <w:tcPr>
-            <w:tcW w:type="dxa" w:w="1656"/>
+            <w:tcW w:type="dxa" w:w="1584"/>
             <w:shd w:val="clear" w:color="auto" w:fill="E8F0FE"/>
           </w:tcPr>
           <w:p>
@@ -1074,13 +1127,13 @@
                 <w:b/>
                 <w:sz w:val="19"/>
               </w:rPr>
-              <w:t>9:50–10:45</w:t>
+              <w:t>9:45–9:55</w:t>
             </w:r>
           </w:p>
         </w:tc>
         <w:tc>
           <w:tcPr>
-            <w:tcW w:type="dxa" w:w="1296"/>
+            <w:tcW w:type="dxa" w:w="1224"/>
             <w:shd w:val="clear" w:color="auto" w:fill="E8F0FE"/>
           </w:tcPr>
           <w:p>
@@ -1091,13 +1144,13 @@
                 <w:b w:val="0"/>
                 <w:sz w:val="19"/>
               </w:rPr>
-              <w:t>55 min</w:t>
+              <w:t>10 min</w:t>
             </w:r>
           </w:p>
         </w:tc>
         <w:tc>
           <w:tcPr>
-            <w:tcW w:type="dxa" w:w="6840"/>
+            <w:tcW w:type="dxa" w:w="6552"/>
             <w:shd w:val="clear" w:color="auto" w:fill="E8F0FE"/>
           </w:tcPr>
           <w:p>
@@ -1108,15 +1161,18 @@
                 <w:b/>
                 <w:sz w:val="19"/>
               </w:rPr>
-              <w:t>TOPIC 01 — Getting Started with AI in Google Sheets: generative AI and Gemini in Sheets; setting up and accessing AI; generating and explaining formulas; effective prompting for spreadsheet tasks (concepts + live demo)</w:t>
+              <w:t>Topic 1 - Fundamentals of Google Sheet. Concepts for Lab 1: what Gemini in Google Sheets can do, prompting and the side panel</w:t>
             </w:r>
           </w:p>
         </w:tc>
       </w:tr>
       <w:tr>
+        <w:trPr>
+          <w:cantSplit/>
+        </w:trPr>
         <w:tc>
           <w:tcPr>
-            <w:tcW w:type="dxa" w:w="1656"/>
+            <w:tcW w:type="dxa" w:w="1584"/>
           </w:tcPr>
           <w:p>
             <w:r/>
@@ -1126,13 +1182,13 @@
                 <w:b w:val="0"/>
                 <w:sz w:val="19"/>
               </w:rPr>
-              <w:t>10:45–11:30</w:t>
+              <w:t>9:55–10:20</w:t>
             </w:r>
           </w:p>
         </w:tc>
         <w:tc>
           <w:tcPr>
-            <w:tcW w:type="dxa" w:w="1296"/>
+            <w:tcW w:type="dxa" w:w="1224"/>
           </w:tcPr>
           <w:p>
             <w:r/>
@@ -1142,13 +1198,13 @@
                 <w:b w:val="0"/>
                 <w:sz w:val="19"/>
               </w:rPr>
-              <w:t>45 min</w:t>
+              <w:t>25 min</w:t>
             </w:r>
           </w:p>
         </w:tc>
         <w:tc>
           <w:tcPr>
-            <w:tcW w:type="dxa" w:w="6840"/>
+            <w:tcW w:type="dxa" w:w="6552"/>
           </w:tcPr>
           <w:p>
             <w:r/>
@@ -1158,15 +1214,127 @@
                 <w:b w:val="0"/>
                 <w:sz w:val="19"/>
               </w:rPr>
-              <w:t>Hands-on: Lab 1: Set Up and Access Gemini AI in Google Sheets; Lab 2: Generate and Explain Formulas with AI</w:t>
+              <w:t>Hands-on: Lab 1 (Gemini Side Panel &amp; Summaries): Open Gemini and Explore the Q3 Candidate Export</w:t>
             </w:r>
           </w:p>
         </w:tc>
       </w:tr>
       <w:tr>
+        <w:trPr>
+          <w:cantSplit/>
+        </w:trPr>
         <w:tc>
           <w:tcPr>
-            <w:tcW w:type="dxa" w:w="1656"/>
+            <w:tcW w:type="dxa" w:w="1584"/>
+            <w:shd w:val="clear" w:color="auto" w:fill="E8F0FE"/>
+          </w:tcPr>
+          <w:p>
+            <w:r/>
+            <w:r>
+              <w:rPr>
+                <w:rFonts w:ascii="Arial" w:hAnsi="Arial"/>
+                <w:b/>
+                <w:sz w:val="19"/>
+              </w:rPr>
+              <w:t>10:20–10:25</w:t>
+            </w:r>
+          </w:p>
+        </w:tc>
+        <w:tc>
+          <w:tcPr>
+            <w:tcW w:type="dxa" w:w="1224"/>
+            <w:shd w:val="clear" w:color="auto" w:fill="E8F0FE"/>
+          </w:tcPr>
+          <w:p>
+            <w:r/>
+            <w:r>
+              <w:rPr>
+                <w:rFonts w:ascii="Arial" w:hAnsi="Arial"/>
+                <w:b w:val="0"/>
+                <w:sz w:val="19"/>
+              </w:rPr>
+              <w:t>5 min</w:t>
+            </w:r>
+          </w:p>
+        </w:tc>
+        <w:tc>
+          <w:tcPr>
+            <w:tcW w:type="dxa" w:w="6552"/>
+            <w:shd w:val="clear" w:color="auto" w:fill="E8F0FE"/>
+          </w:tcPr>
+          <w:p>
+            <w:r/>
+            <w:r>
+              <w:rPr>
+                <w:rFonts w:ascii="Arial" w:hAnsi="Arial"/>
+                <w:b/>
+                <w:sz w:val="19"/>
+              </w:rPr>
+              <w:t>Topic 1 - Concepts for Lab 2: why data quality matters</w:t>
+            </w:r>
+          </w:p>
+        </w:tc>
+      </w:tr>
+      <w:tr>
+        <w:trPr>
+          <w:cantSplit/>
+        </w:trPr>
+        <w:tc>
+          <w:tcPr>
+            <w:tcW w:type="dxa" w:w="1584"/>
+          </w:tcPr>
+          <w:p>
+            <w:r/>
+            <w:r>
+              <w:rPr>
+                <w:rFonts w:ascii="Arial" w:hAnsi="Arial"/>
+                <w:b w:val="0"/>
+                <w:sz w:val="19"/>
+              </w:rPr>
+              <w:t>10:25–10:50</w:t>
+            </w:r>
+          </w:p>
+        </w:tc>
+        <w:tc>
+          <w:tcPr>
+            <w:tcW w:type="dxa" w:w="1224"/>
+          </w:tcPr>
+          <w:p>
+            <w:r/>
+            <w:r>
+              <w:rPr>
+                <w:rFonts w:ascii="Arial" w:hAnsi="Arial"/>
+                <w:b w:val="0"/>
+                <w:sz w:val="19"/>
+              </w:rPr>
+              <w:t>25 min</w:t>
+            </w:r>
+          </w:p>
+        </w:tc>
+        <w:tc>
+          <w:tcPr>
+            <w:tcW w:type="dxa" w:w="6552"/>
+          </w:tcPr>
+          <w:p>
+            <w:r/>
+            <w:r>
+              <w:rPr>
+                <w:rFonts w:ascii="Arial" w:hAnsi="Arial"/>
+                <w:b w:val="0"/>
+                <w:sz w:val="19"/>
+              </w:rPr>
+              <w:t>Hands-on: Lab 2 (Data Quality Check): Check the Quality of the Candidate Data with Gemini</w:t>
+            </w:r>
+          </w:p>
+        </w:tc>
+      </w:tr>
+      <w:tr>
+        <w:trPr>
+          <w:cantSplit/>
+        </w:trPr>
+        <w:tc>
+          <w:tcPr>
+            <w:tcW w:type="dxa" w:w="1584"/>
             <w:shd w:val="clear" w:color="auto" w:fill="FFF4E5"/>
           </w:tcPr>
           <w:p>
@@ -1177,13 +1345,13 @@
                 <w:b w:val="0"/>
                 <w:sz w:val="19"/>
               </w:rPr>
-              <w:t>11:30–11:45</w:t>
+              <w:t>10:50–11:05</w:t>
             </w:r>
           </w:p>
         </w:tc>
         <w:tc>
           <w:tcPr>
-            <w:tcW w:type="dxa" w:w="1296"/>
+            <w:tcW w:type="dxa" w:w="1224"/>
             <w:shd w:val="clear" w:color="auto" w:fill="FFF4E5"/>
           </w:tcPr>
           <w:p>
@@ -1200,7 +1368,7 @@
         </w:tc>
         <w:tc>
           <w:tcPr>
-            <w:tcW w:type="dxa" w:w="6840"/>
+            <w:tcW w:type="dxa" w:w="6552"/>
             <w:shd w:val="clear" w:color="auto" w:fill="FFF4E5"/>
           </w:tcPr>
           <w:p>
@@ -1217,9 +1385,30 @@
         </w:tc>
       </w:tr>
       <w:tr>
+        <w:trPr>
+          <w:cantSplit/>
+        </w:trPr>
         <w:tc>
           <w:tcPr>
-            <w:tcW w:type="dxa" w:w="1656"/>
+            <w:tcW w:type="dxa" w:w="1584"/>
+            <w:shd w:val="clear" w:color="auto" w:fill="E8F0FE"/>
+          </w:tcPr>
+          <w:p>
+            <w:r/>
+            <w:r>
+              <w:rPr>
+                <w:rFonts w:ascii="Arial" w:hAnsi="Arial"/>
+                <w:b/>
+                <w:sz w:val="19"/>
+              </w:rPr>
+              <w:t>11:05–11:10</w:t>
+            </w:r>
+          </w:p>
+        </w:tc>
+        <w:tc>
+          <w:tcPr>
+            <w:tcW w:type="dxa" w:w="1224"/>
+            <w:shd w:val="clear" w:color="auto" w:fill="E8F0FE"/>
           </w:tcPr>
           <w:p>
             <w:r/>
@@ -1229,13 +1418,35 @@
                 <w:b w:val="0"/>
                 <w:sz w:val="19"/>
               </w:rPr>
-              <w:t>11:45–13:00</w:t>
+              <w:t>5 min</w:t>
             </w:r>
           </w:p>
         </w:tc>
         <w:tc>
           <w:tcPr>
-            <w:tcW w:type="dxa" w:w="1296"/>
+            <w:tcW w:type="dxa" w:w="6552"/>
+            <w:shd w:val="clear" w:color="auto" w:fill="E8F0FE"/>
+          </w:tcPr>
+          <w:p>
+            <w:r/>
+            <w:r>
+              <w:rPr>
+                <w:rFonts w:ascii="Arial" w:hAnsi="Arial"/>
+                <w:b/>
+                <w:sz w:val="19"/>
+              </w:rPr>
+              <w:t>Topic 1 - Concepts for Lab 3: Gemini actions (preview, apply, undo) and data prep</w:t>
+            </w:r>
+          </w:p>
+        </w:tc>
+      </w:tr>
+      <w:tr>
+        <w:trPr>
+          <w:cantSplit/>
+        </w:trPr>
+        <w:tc>
+          <w:tcPr>
+            <w:tcW w:type="dxa" w:w="1584"/>
           </w:tcPr>
           <w:p>
             <w:r/>
@@ -1245,13 +1456,13 @@
                 <w:b w:val="0"/>
                 <w:sz w:val="19"/>
               </w:rPr>
-              <w:t>75 min</w:t>
+              <w:t>11:10–11:40</w:t>
             </w:r>
           </w:p>
         </w:tc>
         <w:tc>
           <w:tcPr>
-            <w:tcW w:type="dxa" w:w="6840"/>
+            <w:tcW w:type="dxa" w:w="1224"/>
           </w:tcPr>
           <w:p>
             <w:r/>
@@ -1261,15 +1472,252 @@
                 <w:b w:val="0"/>
                 <w:sz w:val="19"/>
               </w:rPr>
-              <w:t>Hands-on: Lab 3: Combine and Troubleshoot Formulas with AI; Lab 4: Write Effective Prompts for Spreadsheet Tasks</w:t>
+              <w:t>30 min</w:t>
+            </w:r>
+          </w:p>
+        </w:tc>
+        <w:tc>
+          <w:tcPr>
+            <w:tcW w:type="dxa" w:w="6552"/>
+          </w:tcPr>
+          <w:p>
+            <w:r/>
+            <w:r>
+              <w:rPr>
+                <w:rFonts w:ascii="Arial" w:hAnsi="Arial"/>
+                <w:b w:val="0"/>
+                <w:sz w:val="19"/>
+              </w:rPr>
+              <w:t>Hands-on: Lab 3 (Data Prep): Clean and Prepare the Candidate Data with Gemini Actions</w:t>
             </w:r>
           </w:p>
         </w:tc>
       </w:tr>
       <w:tr>
+        <w:trPr>
+          <w:cantSplit/>
+        </w:trPr>
         <w:tc>
           <w:tcPr>
-            <w:tcW w:type="dxa" w:w="1656"/>
+            <w:tcW w:type="dxa" w:w="1584"/>
+            <w:shd w:val="clear" w:color="auto" w:fill="E8F0FE"/>
+          </w:tcPr>
+          <w:p>
+            <w:r/>
+            <w:r>
+              <w:rPr>
+                <w:rFonts w:ascii="Arial" w:hAnsi="Arial"/>
+                <w:b/>
+                <w:sz w:val="19"/>
+              </w:rPr>
+              <w:t>11:40–11:45</w:t>
+            </w:r>
+          </w:p>
+        </w:tc>
+        <w:tc>
+          <w:tcPr>
+            <w:tcW w:type="dxa" w:w="1224"/>
+            <w:shd w:val="clear" w:color="auto" w:fill="E8F0FE"/>
+          </w:tcPr>
+          <w:p>
+            <w:r/>
+            <w:r>
+              <w:rPr>
+                <w:rFonts w:ascii="Arial" w:hAnsi="Arial"/>
+                <w:b w:val="0"/>
+                <w:sz w:val="19"/>
+              </w:rPr>
+              <w:t>5 min</w:t>
+            </w:r>
+          </w:p>
+        </w:tc>
+        <w:tc>
+          <w:tcPr>
+            <w:tcW w:type="dxa" w:w="6552"/>
+            <w:shd w:val="clear" w:color="auto" w:fill="E8F0FE"/>
+          </w:tcPr>
+          <w:p>
+            <w:r/>
+            <w:r>
+              <w:rPr>
+                <w:rFonts w:ascii="Arial" w:hAnsi="Arial"/>
+                <w:b/>
+                <w:sz w:val="19"/>
+              </w:rPr>
+              <w:t>Topic 1 - Concepts for Lab 4: VLOOKUP, COUNTIF and nested IF; generating, explaining and fixing formulas</w:t>
+            </w:r>
+          </w:p>
+        </w:tc>
+      </w:tr>
+      <w:tr>
+        <w:trPr>
+          <w:cantSplit/>
+        </w:trPr>
+        <w:tc>
+          <w:tcPr>
+            <w:tcW w:type="dxa" w:w="1584"/>
+          </w:tcPr>
+          <w:p>
+            <w:r/>
+            <w:r>
+              <w:rPr>
+                <w:rFonts w:ascii="Arial" w:hAnsi="Arial"/>
+                <w:b w:val="0"/>
+                <w:sz w:val="19"/>
+              </w:rPr>
+              <w:t>11:45–12:15</w:t>
+            </w:r>
+          </w:p>
+        </w:tc>
+        <w:tc>
+          <w:tcPr>
+            <w:tcW w:type="dxa" w:w="1224"/>
+          </w:tcPr>
+          <w:p>
+            <w:r/>
+            <w:r>
+              <w:rPr>
+                <w:rFonts w:ascii="Arial" w:hAnsi="Arial"/>
+                <w:b w:val="0"/>
+                <w:sz w:val="19"/>
+              </w:rPr>
+              <w:t>30 min</w:t>
+            </w:r>
+          </w:p>
+        </w:tc>
+        <w:tc>
+          <w:tcPr>
+            <w:tcW w:type="dxa" w:w="6552"/>
+          </w:tcPr>
+          <w:p>
+            <w:r/>
+            <w:r>
+              <w:rPr>
+                <w:rFonts w:ascii="Arial" w:hAnsi="Arial"/>
+                <w:b w:val="0"/>
+                <w:sz w:val="19"/>
+              </w:rPr>
+              <w:t>Hands-on: Lab 4 (Formulas: VLOOKUP, COUNTIF &amp; Nested IF): Generate, Explain and Fix Screening Formulas</w:t>
+            </w:r>
+          </w:p>
+        </w:tc>
+      </w:tr>
+      <w:tr>
+        <w:trPr>
+          <w:cantSplit/>
+        </w:trPr>
+        <w:tc>
+          <w:tcPr>
+            <w:tcW w:type="dxa" w:w="1584"/>
+            <w:shd w:val="clear" w:color="auto" w:fill="E8F0FE"/>
+          </w:tcPr>
+          <w:p>
+            <w:r/>
+            <w:r>
+              <w:rPr>
+                <w:rFonts w:ascii="Arial" w:hAnsi="Arial"/>
+                <w:b/>
+                <w:sz w:val="19"/>
+              </w:rPr>
+              <w:t>12:15–12:25</w:t>
+            </w:r>
+          </w:p>
+        </w:tc>
+        <w:tc>
+          <w:tcPr>
+            <w:tcW w:type="dxa" w:w="1224"/>
+            <w:shd w:val="clear" w:color="auto" w:fill="E8F0FE"/>
+          </w:tcPr>
+          <w:p>
+            <w:r/>
+            <w:r>
+              <w:rPr>
+                <w:rFonts w:ascii="Arial" w:hAnsi="Arial"/>
+                <w:b w:val="0"/>
+                <w:sz w:val="19"/>
+              </w:rPr>
+              <w:t>10 min</w:t>
+            </w:r>
+          </w:p>
+        </w:tc>
+        <w:tc>
+          <w:tcPr>
+            <w:tcW w:type="dxa" w:w="6552"/>
+            <w:shd w:val="clear" w:color="auto" w:fill="E8F0FE"/>
+          </w:tcPr>
+          <w:p>
+            <w:r/>
+            <w:r>
+              <w:rPr>
+                <w:rFonts w:ascii="Arial" w:hAnsi="Arial"/>
+                <w:b/>
+                <w:sz w:val="19"/>
+              </w:rPr>
+              <w:t>Topic 2 - Data Analytics and Visualization. Concepts for Lab 5: tables, trackers and dropdowns; conditional formatting</w:t>
+            </w:r>
+          </w:p>
+        </w:tc>
+      </w:tr>
+      <w:tr>
+        <w:trPr>
+          <w:cantSplit/>
+        </w:trPr>
+        <w:tc>
+          <w:tcPr>
+            <w:tcW w:type="dxa" w:w="1584"/>
+          </w:tcPr>
+          <w:p>
+            <w:r/>
+            <w:r>
+              <w:rPr>
+                <w:rFonts w:ascii="Arial" w:hAnsi="Arial"/>
+                <w:b w:val="0"/>
+                <w:sz w:val="19"/>
+              </w:rPr>
+              <w:t>12:25–12:55</w:t>
+            </w:r>
+          </w:p>
+        </w:tc>
+        <w:tc>
+          <w:tcPr>
+            <w:tcW w:type="dxa" w:w="1224"/>
+          </w:tcPr>
+          <w:p>
+            <w:r/>
+            <w:r>
+              <w:rPr>
+                <w:rFonts w:ascii="Arial" w:hAnsi="Arial"/>
+                <w:b w:val="0"/>
+                <w:sz w:val="19"/>
+              </w:rPr>
+              <w:t>30 min</w:t>
+            </w:r>
+          </w:p>
+        </w:tc>
+        <w:tc>
+          <w:tcPr>
+            <w:tcW w:type="dxa" w:w="6552"/>
+          </w:tcPr>
+          <w:p>
+            <w:r/>
+            <w:r>
+              <w:rPr>
+                <w:rFonts w:ascii="Arial" w:hAnsi="Arial"/>
+                <w:b w:val="0"/>
+                <w:sz w:val="19"/>
+              </w:rPr>
+              <w:t>Hands-on: Lab 5 (Tables, Trackers &amp; Conditional Formatting): Build a Colour-Coded Interview Tracker from Unstructured Notes</w:t>
+            </w:r>
+          </w:p>
+        </w:tc>
+      </w:tr>
+      <w:tr>
+        <w:trPr>
+          <w:cantSplit/>
+        </w:trPr>
+        <w:tc>
+          <w:tcPr>
+            <w:tcW w:type="dxa" w:w="1584"/>
             <w:shd w:val="clear" w:color="auto" w:fill="FDE9D9"/>
           </w:tcPr>
           <w:p>
@@ -1280,13 +1728,13 @@
                 <w:b w:val="0"/>
                 <w:sz w:val="19"/>
               </w:rPr>
-              <w:t>13:00–14:00</w:t>
+              <w:t>12:55–13:55</w:t>
             </w:r>
           </w:p>
         </w:tc>
         <w:tc>
           <w:tcPr>
-            <w:tcW w:type="dxa" w:w="1296"/>
+            <w:tcW w:type="dxa" w:w="1224"/>
             <w:shd w:val="clear" w:color="auto" w:fill="FDE9D9"/>
           </w:tcPr>
           <w:p>
@@ -1303,7 +1751,7 @@
         </w:tc>
         <w:tc>
           <w:tcPr>
-            <w:tcW w:type="dxa" w:w="6840"/>
+            <w:tcW w:type="dxa" w:w="6552"/>
             <w:shd w:val="clear" w:color="auto" w:fill="FDE9D9"/>
           </w:tcPr>
           <w:p>
@@ -1320,9 +1768,12 @@
         </w:tc>
       </w:tr>
       <w:tr>
+        <w:trPr>
+          <w:cantSplit/>
+        </w:trPr>
         <w:tc>
           <w:tcPr>
-            <w:tcW w:type="dxa" w:w="1656"/>
+            <w:tcW w:type="dxa" w:w="1584"/>
             <w:shd w:val="clear" w:color="auto" w:fill="E8F0FE"/>
           </w:tcPr>
           <w:p>
@@ -1333,13 +1784,13 @@
                 <w:b/>
                 <w:sz w:val="19"/>
               </w:rPr>
-              <w:t>14:00–14:50</w:t>
+              <w:t>13:55–14:00</w:t>
             </w:r>
           </w:p>
         </w:tc>
         <w:tc>
           <w:tcPr>
-            <w:tcW w:type="dxa" w:w="1296"/>
+            <w:tcW w:type="dxa" w:w="1224"/>
             <w:shd w:val="clear" w:color="auto" w:fill="E8F0FE"/>
           </w:tcPr>
           <w:p>
@@ -1350,13 +1801,13 @@
                 <w:b w:val="0"/>
                 <w:sz w:val="19"/>
               </w:rPr>
-              <w:t>50 min</w:t>
+              <w:t>5 min</w:t>
             </w:r>
           </w:p>
         </w:tc>
         <w:tc>
           <w:tcPr>
-            <w:tcW w:type="dxa" w:w="6840"/>
+            <w:tcW w:type="dxa" w:w="6552"/>
             <w:shd w:val="clear" w:color="auto" w:fill="E8F0FE"/>
           </w:tcPr>
           <w:p>
@@ -1367,15 +1818,18 @@
                 <w:b/>
                 <w:sz w:val="19"/>
               </w:rPr>
-              <w:t>TOPIC 02 — Analysing and Automating Data with AI in Sheets: cleaning, transforming and organising data; summarising and analysing datasets; creating tables, charts and visualisations; validating AI output and applying AI safely to work data (concepts + live demo)</w:t>
+              <w:t>Topic 2 - Concepts for Lab 6: the AI function (=AI), Fill with Gemini and AI columns</w:t>
             </w:r>
           </w:p>
         </w:tc>
       </w:tr>
       <w:tr>
+        <w:trPr>
+          <w:cantSplit/>
+        </w:trPr>
         <w:tc>
           <w:tcPr>
-            <w:tcW w:type="dxa" w:w="1656"/>
+            <w:tcW w:type="dxa" w:w="1584"/>
           </w:tcPr>
           <w:p>
             <w:r/>
@@ -1385,13 +1839,13 @@
                 <w:b w:val="0"/>
                 <w:sz w:val="19"/>
               </w:rPr>
-              <w:t>14:50–15:30</w:t>
+              <w:t>14:00–14:30</w:t>
             </w:r>
           </w:p>
         </w:tc>
         <w:tc>
           <w:tcPr>
-            <w:tcW w:type="dxa" w:w="1296"/>
+            <w:tcW w:type="dxa" w:w="1224"/>
           </w:tcPr>
           <w:p>
             <w:r/>
@@ -1401,13 +1855,13 @@
                 <w:b w:val="0"/>
                 <w:sz w:val="19"/>
               </w:rPr>
-              <w:t>40 min</w:t>
+              <w:t>30 min</w:t>
             </w:r>
           </w:p>
         </w:tc>
         <w:tc>
           <w:tcPr>
-            <w:tcW w:type="dxa" w:w="6840"/>
+            <w:tcW w:type="dxa" w:w="6552"/>
           </w:tcPr>
           <w:p>
             <w:r/>
@@ -1417,15 +1871,236 @@
                 <w:b w:val="0"/>
                 <w:sz w:val="19"/>
               </w:rPr>
-              <w:t>Hands-on: Lab 5: Clean, Transform and Organise Data with AI</w:t>
+              <w:t>Hands-on: Lab 6 (AI Function &amp; Fill with Gemini): Extract and Categorise Candidate Text with the AI Function</w:t>
             </w:r>
           </w:p>
         </w:tc>
       </w:tr>
       <w:tr>
+        <w:trPr>
+          <w:cantSplit/>
+        </w:trPr>
         <w:tc>
           <w:tcPr>
-            <w:tcW w:type="dxa" w:w="1656"/>
+            <w:tcW w:type="dxa" w:w="1584"/>
+            <w:shd w:val="clear" w:color="auto" w:fill="E8F0FE"/>
+          </w:tcPr>
+          <w:p>
+            <w:r/>
+            <w:r>
+              <w:rPr>
+                <w:rFonts w:ascii="Arial" w:hAnsi="Arial"/>
+                <w:b/>
+                <w:sz w:val="19"/>
+              </w:rPr>
+              <w:t>14:30–14:35</w:t>
+            </w:r>
+          </w:p>
+        </w:tc>
+        <w:tc>
+          <w:tcPr>
+            <w:tcW w:type="dxa" w:w="1224"/>
+            <w:shd w:val="clear" w:color="auto" w:fill="E8F0FE"/>
+          </w:tcPr>
+          <w:p>
+            <w:r/>
+            <w:r>
+              <w:rPr>
+                <w:rFonts w:ascii="Arial" w:hAnsi="Arial"/>
+                <w:b w:val="0"/>
+                <w:sz w:val="19"/>
+              </w:rPr>
+              <w:t>5 min</w:t>
+            </w:r>
+          </w:p>
+        </w:tc>
+        <w:tc>
+          <w:tcPr>
+            <w:tcW w:type="dxa" w:w="6552"/>
+            <w:shd w:val="clear" w:color="auto" w:fill="E8F0FE"/>
+          </w:tcPr>
+          <w:p>
+            <w:r/>
+            <w:r>
+              <w:rPr>
+                <w:rFonts w:ascii="Arial" w:hAnsi="Arial"/>
+                <w:b/>
+                <w:sz w:val="19"/>
+              </w:rPr>
+              <w:t>Topic 2 - Concepts for Lab 7: data analysis and insights with Gemini; pivot tables</w:t>
+            </w:r>
+          </w:p>
+        </w:tc>
+      </w:tr>
+      <w:tr>
+        <w:trPr>
+          <w:cantSplit/>
+        </w:trPr>
+        <w:tc>
+          <w:tcPr>
+            <w:tcW w:type="dxa" w:w="1584"/>
+          </w:tcPr>
+          <w:p>
+            <w:r/>
+            <w:r>
+              <w:rPr>
+                <w:rFonts w:ascii="Arial" w:hAnsi="Arial"/>
+                <w:b w:val="0"/>
+                <w:sz w:val="19"/>
+              </w:rPr>
+              <w:t>14:35–15:05</w:t>
+            </w:r>
+          </w:p>
+        </w:tc>
+        <w:tc>
+          <w:tcPr>
+            <w:tcW w:type="dxa" w:w="1224"/>
+          </w:tcPr>
+          <w:p>
+            <w:r/>
+            <w:r>
+              <w:rPr>
+                <w:rFonts w:ascii="Arial" w:hAnsi="Arial"/>
+                <w:b w:val="0"/>
+                <w:sz w:val="19"/>
+              </w:rPr>
+              <w:t>30 min</w:t>
+            </w:r>
+          </w:p>
+        </w:tc>
+        <w:tc>
+          <w:tcPr>
+            <w:tcW w:type="dxa" w:w="6552"/>
+          </w:tcPr>
+          <w:p>
+            <w:r/>
+            <w:r>
+              <w:rPr>
+                <w:rFonts w:ascii="Arial" w:hAnsi="Arial"/>
+                <w:b w:val="0"/>
+                <w:sz w:val="19"/>
+              </w:rPr>
+              <w:t>Hands-on: Lab 7 (Data Analysis &amp; Insights): Generate Hiring Insights and Pivot Tables with Gemini</w:t>
+            </w:r>
+          </w:p>
+        </w:tc>
+      </w:tr>
+      <w:tr>
+        <w:trPr>
+          <w:cantSplit/>
+        </w:trPr>
+        <w:tc>
+          <w:tcPr>
+            <w:tcW w:type="dxa" w:w="1584"/>
+            <w:shd w:val="clear" w:color="auto" w:fill="E8F0FE"/>
+          </w:tcPr>
+          <w:p>
+            <w:r/>
+            <w:r>
+              <w:rPr>
+                <w:rFonts w:ascii="Arial" w:hAnsi="Arial"/>
+                <w:b/>
+                <w:sz w:val="19"/>
+              </w:rPr>
+              <w:t>15:05–15:10</w:t>
+            </w:r>
+          </w:p>
+        </w:tc>
+        <w:tc>
+          <w:tcPr>
+            <w:tcW w:type="dxa" w:w="1224"/>
+            <w:shd w:val="clear" w:color="auto" w:fill="E8F0FE"/>
+          </w:tcPr>
+          <w:p>
+            <w:r/>
+            <w:r>
+              <w:rPr>
+                <w:rFonts w:ascii="Arial" w:hAnsi="Arial"/>
+                <w:b w:val="0"/>
+                <w:sz w:val="19"/>
+              </w:rPr>
+              <w:t>5 min</w:t>
+            </w:r>
+          </w:p>
+        </w:tc>
+        <w:tc>
+          <w:tcPr>
+            <w:tcW w:type="dxa" w:w="6552"/>
+            <w:shd w:val="clear" w:color="auto" w:fill="E8F0FE"/>
+          </w:tcPr>
+          <w:p>
+            <w:r/>
+            <w:r>
+              <w:rPr>
+                <w:rFonts w:ascii="Arial" w:hAnsi="Arial"/>
+                <w:b/>
+                <w:sz w:val="19"/>
+              </w:rPr>
+              <w:t>Topic 2 - Concepts for Lab 8: charts and graphs with Gemini; inserted vs linked charts</w:t>
+            </w:r>
+          </w:p>
+        </w:tc>
+      </w:tr>
+      <w:tr>
+        <w:trPr>
+          <w:cantSplit/>
+        </w:trPr>
+        <w:tc>
+          <w:tcPr>
+            <w:tcW w:type="dxa" w:w="1584"/>
+          </w:tcPr>
+          <w:p>
+            <w:r/>
+            <w:r>
+              <w:rPr>
+                <w:rFonts w:ascii="Arial" w:hAnsi="Arial"/>
+                <w:b w:val="0"/>
+                <w:sz w:val="19"/>
+              </w:rPr>
+              <w:t>15:10–15:40</w:t>
+            </w:r>
+          </w:p>
+        </w:tc>
+        <w:tc>
+          <w:tcPr>
+            <w:tcW w:type="dxa" w:w="1224"/>
+          </w:tcPr>
+          <w:p>
+            <w:r/>
+            <w:r>
+              <w:rPr>
+                <w:rFonts w:ascii="Arial" w:hAnsi="Arial"/>
+                <w:b w:val="0"/>
+                <w:sz w:val="19"/>
+              </w:rPr>
+              <w:t>30 min</w:t>
+            </w:r>
+          </w:p>
+        </w:tc>
+        <w:tc>
+          <w:tcPr>
+            <w:tcW w:type="dxa" w:w="6552"/>
+          </w:tcPr>
+          <w:p>
+            <w:r/>
+            <w:r>
+              <w:rPr>
+                <w:rFonts w:ascii="Arial" w:hAnsi="Arial"/>
+                <w:b w:val="0"/>
+                <w:sz w:val="19"/>
+              </w:rPr>
+              <w:t>Hands-on: Lab 8 (Charts &amp; Visualisation): Build Charts That Tell the Hiring Story</w:t>
+            </w:r>
+          </w:p>
+        </w:tc>
+      </w:tr>
+      <w:tr>
+        <w:trPr>
+          <w:cantSplit/>
+        </w:trPr>
+        <w:tc>
+          <w:tcPr>
+            <w:tcW w:type="dxa" w:w="1584"/>
             <w:shd w:val="clear" w:color="auto" w:fill="FFF4E5"/>
           </w:tcPr>
           <w:p>
@@ -1436,13 +2111,13 @@
                 <w:b w:val="0"/>
                 <w:sz w:val="19"/>
               </w:rPr>
-              <w:t>15:30–15:45</w:t>
+              <w:t>15:40–15:55</w:t>
             </w:r>
           </w:p>
         </w:tc>
         <w:tc>
           <w:tcPr>
-            <w:tcW w:type="dxa" w:w="1296"/>
+            <w:tcW w:type="dxa" w:w="1224"/>
             <w:shd w:val="clear" w:color="auto" w:fill="FFF4E5"/>
           </w:tcPr>
           <w:p>
@@ -1459,7 +2134,7 @@
         </w:tc>
         <w:tc>
           <w:tcPr>
-            <w:tcW w:type="dxa" w:w="6840"/>
+            <w:tcW w:type="dxa" w:w="6552"/>
             <w:shd w:val="clear" w:color="auto" w:fill="FFF4E5"/>
           </w:tcPr>
           <w:p>
@@ -1476,9 +2151,30 @@
         </w:tc>
       </w:tr>
       <w:tr>
+        <w:trPr>
+          <w:cantSplit/>
+        </w:trPr>
         <w:tc>
           <w:tcPr>
-            <w:tcW w:type="dxa" w:w="1656"/>
+            <w:tcW w:type="dxa" w:w="1584"/>
+            <w:shd w:val="clear" w:color="auto" w:fill="E8F0FE"/>
+          </w:tcPr>
+          <w:p>
+            <w:r/>
+            <w:r>
+              <w:rPr>
+                <w:rFonts w:ascii="Arial" w:hAnsi="Arial"/>
+                <w:b/>
+                <w:sz w:val="19"/>
+              </w:rPr>
+              <w:t>15:55–16:05</w:t>
+            </w:r>
+          </w:p>
+        </w:tc>
+        <w:tc>
+          <w:tcPr>
+            <w:tcW w:type="dxa" w:w="1224"/>
+            <w:shd w:val="clear" w:color="auto" w:fill="E8F0FE"/>
           </w:tcPr>
           <w:p>
             <w:r/>
@@ -1488,13 +2184,35 @@
                 <w:b w:val="0"/>
                 <w:sz w:val="19"/>
               </w:rPr>
-              <w:t>15:45–18:15</w:t>
+              <w:t>10 min</w:t>
             </w:r>
           </w:p>
         </w:tc>
         <w:tc>
           <w:tcPr>
-            <w:tcW w:type="dxa" w:w="1296"/>
+            <w:tcW w:type="dxa" w:w="6552"/>
+            <w:shd w:val="clear" w:color="auto" w:fill="E8F0FE"/>
+          </w:tcPr>
+          <w:p>
+            <w:r/>
+            <w:r>
+              <w:rPr>
+                <w:rFonts w:ascii="Arial" w:hAnsi="Arial"/>
+                <w:b/>
+                <w:sz w:val="19"/>
+              </w:rPr>
+              <w:t>Topic 3 - Interactive Dashboard. Concepts for Lab 9: what makes a dashboard interactive; KPI formulas driven by dropdowns</w:t>
+            </w:r>
+          </w:p>
+        </w:tc>
+      </w:tr>
+      <w:tr>
+        <w:trPr>
+          <w:cantSplit/>
+        </w:trPr>
+        <w:tc>
+          <w:tcPr>
+            <w:tcW w:type="dxa" w:w="1584"/>
           </w:tcPr>
           <w:p>
             <w:r/>
@@ -1504,13 +2222,13 @@
                 <w:b w:val="0"/>
                 <w:sz w:val="19"/>
               </w:rPr>
-              <w:t>150 min</w:t>
+              <w:t>16:05–16:35</w:t>
             </w:r>
           </w:p>
         </w:tc>
         <w:tc>
           <w:tcPr>
-            <w:tcW w:type="dxa" w:w="6840"/>
+            <w:tcW w:type="dxa" w:w="1224"/>
           </w:tcPr>
           <w:p>
             <w:r/>
@@ -1520,15 +2238,361 @@
                 <w:b w:val="0"/>
                 <w:sz w:val="19"/>
               </w:rPr>
-              <w:t>Hands-on: Lab 6: Summarise and Analyse Your Dataset with AI; Lab 7: Create Tables, Charts and Visualisations with AI; Lab 8: Validate AI Output and Apply AI Safely to Work Data</w:t>
+              <w:t>30 min</w:t>
+            </w:r>
+          </w:p>
+        </w:tc>
+        <w:tc>
+          <w:tcPr>
+            <w:tcW w:type="dxa" w:w="6552"/>
+          </w:tcPr>
+          <w:p>
+            <w:r/>
+            <w:r>
+              <w:rPr>
+                <w:rFonts w:ascii="Arial" w:hAnsi="Arial"/>
+                <w:b w:val="0"/>
+                <w:sz w:val="19"/>
+              </w:rPr>
+              <w:t>Hands-on: Lab 9 (Dashboard KPIs &amp; Selectors): Build the Dashboard's Selectors and KPI Formulas</w:t>
             </w:r>
           </w:p>
         </w:tc>
       </w:tr>
       <w:tr>
+        <w:trPr>
+          <w:cantSplit/>
+        </w:trPr>
         <w:tc>
           <w:tcPr>
-            <w:tcW w:type="dxa" w:w="1656"/>
+            <w:tcW w:type="dxa" w:w="1584"/>
+            <w:shd w:val="clear" w:color="auto" w:fill="E8F0FE"/>
+          </w:tcPr>
+          <w:p>
+            <w:r/>
+            <w:r>
+              <w:rPr>
+                <w:rFonts w:ascii="Arial" w:hAnsi="Arial"/>
+                <w:b/>
+                <w:sz w:val="19"/>
+              </w:rPr>
+              <w:t>16:35–16:40</w:t>
+            </w:r>
+          </w:p>
+        </w:tc>
+        <w:tc>
+          <w:tcPr>
+            <w:tcW w:type="dxa" w:w="1224"/>
+            <w:shd w:val="clear" w:color="auto" w:fill="E8F0FE"/>
+          </w:tcPr>
+          <w:p>
+            <w:r/>
+            <w:r>
+              <w:rPr>
+                <w:rFonts w:ascii="Arial" w:hAnsi="Arial"/>
+                <w:b w:val="0"/>
+                <w:sz w:val="19"/>
+              </w:rPr>
+              <w:t>5 min</w:t>
+            </w:r>
+          </w:p>
+        </w:tc>
+        <w:tc>
+          <w:tcPr>
+            <w:tcW w:type="dxa" w:w="6552"/>
+            <w:shd w:val="clear" w:color="auto" w:fill="E8F0FE"/>
+          </w:tcPr>
+          <w:p>
+            <w:r/>
+            <w:r>
+              <w:rPr>
+                <w:rFonts w:ascii="Arial" w:hAnsi="Arial"/>
+                <w:b/>
+                <w:sz w:val="19"/>
+              </w:rPr>
+              <w:t>Topic 3 - Concepts for Lab 10: dashboard design - linked charts, alerts and protection</w:t>
+            </w:r>
+          </w:p>
+        </w:tc>
+      </w:tr>
+      <w:tr>
+        <w:trPr>
+          <w:cantSplit/>
+        </w:trPr>
+        <w:tc>
+          <w:tcPr>
+            <w:tcW w:type="dxa" w:w="1584"/>
+          </w:tcPr>
+          <w:p>
+            <w:r/>
+            <w:r>
+              <w:rPr>
+                <w:rFonts w:ascii="Arial" w:hAnsi="Arial"/>
+                <w:b w:val="0"/>
+                <w:sz w:val="19"/>
+              </w:rPr>
+              <w:t>16:40–17:10</w:t>
+            </w:r>
+          </w:p>
+        </w:tc>
+        <w:tc>
+          <w:tcPr>
+            <w:tcW w:type="dxa" w:w="1224"/>
+          </w:tcPr>
+          <w:p>
+            <w:r/>
+            <w:r>
+              <w:rPr>
+                <w:rFonts w:ascii="Arial" w:hAnsi="Arial"/>
+                <w:b w:val="0"/>
+                <w:sz w:val="19"/>
+              </w:rPr>
+              <w:t>30 min</w:t>
+            </w:r>
+          </w:p>
+        </w:tc>
+        <w:tc>
+          <w:tcPr>
+            <w:tcW w:type="dxa" w:w="6552"/>
+          </w:tcPr>
+          <w:p>
+            <w:r/>
+            <w:r>
+              <w:rPr>
+                <w:rFonts w:ascii="Arial" w:hAnsi="Arial"/>
+                <w:b w:val="0"/>
+                <w:sz w:val="19"/>
+              </w:rPr>
+              <w:t>Hands-on: Lab 10 (Interactive Dashboard): Make the Hiring Dashboard Interactive and Visual</w:t>
+            </w:r>
+          </w:p>
+        </w:tc>
+      </w:tr>
+      <w:tr>
+        <w:trPr>
+          <w:cantSplit/>
+        </w:trPr>
+        <w:tc>
+          <w:tcPr>
+            <w:tcW w:type="dxa" w:w="1584"/>
+            <w:shd w:val="clear" w:color="auto" w:fill="E8F0FE"/>
+          </w:tcPr>
+          <w:p>
+            <w:r/>
+            <w:r>
+              <w:rPr>
+                <w:rFonts w:ascii="Arial" w:hAnsi="Arial"/>
+                <w:b/>
+                <w:sz w:val="19"/>
+              </w:rPr>
+              <w:t>17:10–17:15</w:t>
+            </w:r>
+          </w:p>
+        </w:tc>
+        <w:tc>
+          <w:tcPr>
+            <w:tcW w:type="dxa" w:w="1224"/>
+            <w:shd w:val="clear" w:color="auto" w:fill="E8F0FE"/>
+          </w:tcPr>
+          <w:p>
+            <w:r/>
+            <w:r>
+              <w:rPr>
+                <w:rFonts w:ascii="Arial" w:hAnsi="Arial"/>
+                <w:b w:val="0"/>
+                <w:sz w:val="19"/>
+              </w:rPr>
+              <w:t>5 min</w:t>
+            </w:r>
+          </w:p>
+        </w:tc>
+        <w:tc>
+          <w:tcPr>
+            <w:tcW w:type="dxa" w:w="6552"/>
+            <w:shd w:val="clear" w:color="auto" w:fill="E8F0FE"/>
+          </w:tcPr>
+          <w:p>
+            <w:r/>
+            <w:r>
+              <w:rPr>
+                <w:rFonts w:ascii="Arial" w:hAnsi="Arial"/>
+                <w:b/>
+                <w:sz w:val="19"/>
+              </w:rPr>
+              <w:t>Topic 3 - Concepts for Lab 11: Gems and writing fair Gem instructions</w:t>
+            </w:r>
+          </w:p>
+        </w:tc>
+      </w:tr>
+      <w:tr>
+        <w:trPr>
+          <w:cantSplit/>
+        </w:trPr>
+        <w:tc>
+          <w:tcPr>
+            <w:tcW w:type="dxa" w:w="1584"/>
+          </w:tcPr>
+          <w:p>
+            <w:r/>
+            <w:r>
+              <w:rPr>
+                <w:rFonts w:ascii="Arial" w:hAnsi="Arial"/>
+                <w:b w:val="0"/>
+                <w:sz w:val="19"/>
+              </w:rPr>
+              <w:t>17:15–17:45</w:t>
+            </w:r>
+          </w:p>
+        </w:tc>
+        <w:tc>
+          <w:tcPr>
+            <w:tcW w:type="dxa" w:w="1224"/>
+          </w:tcPr>
+          <w:p>
+            <w:r/>
+            <w:r>
+              <w:rPr>
+                <w:rFonts w:ascii="Arial" w:hAnsi="Arial"/>
+                <w:b w:val="0"/>
+                <w:sz w:val="19"/>
+              </w:rPr>
+              <w:t>30 min</w:t>
+            </w:r>
+          </w:p>
+        </w:tc>
+        <w:tc>
+          <w:tcPr>
+            <w:tcW w:type="dxa" w:w="6552"/>
+          </w:tcPr>
+          <w:p>
+            <w:r/>
+            <w:r>
+              <w:rPr>
+                <w:rFonts w:ascii="Arial" w:hAnsi="Arial"/>
+                <w:b w:val="0"/>
+                <w:sz w:val="19"/>
+              </w:rPr>
+              <w:t>Hands-on: Lab 11 (Gems): Create a Candidate Screener Gem and Use It in Sheets</w:t>
+            </w:r>
+          </w:p>
+        </w:tc>
+      </w:tr>
+      <w:tr>
+        <w:trPr>
+          <w:cantSplit/>
+        </w:trPr>
+        <w:tc>
+          <w:tcPr>
+            <w:tcW w:type="dxa" w:w="1584"/>
+            <w:shd w:val="clear" w:color="auto" w:fill="E8F0FE"/>
+          </w:tcPr>
+          <w:p>
+            <w:r/>
+            <w:r>
+              <w:rPr>
+                <w:rFonts w:ascii="Arial" w:hAnsi="Arial"/>
+                <w:b/>
+                <w:sz w:val="19"/>
+              </w:rPr>
+              <w:t>17:45–17:50</w:t>
+            </w:r>
+          </w:p>
+        </w:tc>
+        <w:tc>
+          <w:tcPr>
+            <w:tcW w:type="dxa" w:w="1224"/>
+            <w:shd w:val="clear" w:color="auto" w:fill="E8F0FE"/>
+          </w:tcPr>
+          <w:p>
+            <w:r/>
+            <w:r>
+              <w:rPr>
+                <w:rFonts w:ascii="Arial" w:hAnsi="Arial"/>
+                <w:b w:val="0"/>
+                <w:sz w:val="19"/>
+              </w:rPr>
+              <w:t>5 min</w:t>
+            </w:r>
+          </w:p>
+        </w:tc>
+        <w:tc>
+          <w:tcPr>
+            <w:tcW w:type="dxa" w:w="6552"/>
+            <w:shd w:val="clear" w:color="auto" w:fill="E8F0FE"/>
+          </w:tcPr>
+          <w:p>
+            <w:r/>
+            <w:r>
+              <w:rPr>
+                <w:rFonts w:ascii="Arial" w:hAnsi="Arial"/>
+                <w:b/>
+                <w:sz w:val="19"/>
+              </w:rPr>
+              <w:t>Topic 3 - Concepts for Lab 12: the optimisation problem solver; sharing and responsible use</w:t>
+            </w:r>
+          </w:p>
+        </w:tc>
+      </w:tr>
+      <w:tr>
+        <w:trPr>
+          <w:cantSplit/>
+        </w:trPr>
+        <w:tc>
+          <w:tcPr>
+            <w:tcW w:type="dxa" w:w="1584"/>
+          </w:tcPr>
+          <w:p>
+            <w:r/>
+            <w:r>
+              <w:rPr>
+                <w:rFonts w:ascii="Arial" w:hAnsi="Arial"/>
+                <w:b w:val="0"/>
+                <w:sz w:val="19"/>
+              </w:rPr>
+              <w:t>17:50–18:20</w:t>
+            </w:r>
+          </w:p>
+        </w:tc>
+        <w:tc>
+          <w:tcPr>
+            <w:tcW w:type="dxa" w:w="1224"/>
+          </w:tcPr>
+          <w:p>
+            <w:r/>
+            <w:r>
+              <w:rPr>
+                <w:rFonts w:ascii="Arial" w:hAnsi="Arial"/>
+                <w:b w:val="0"/>
+                <w:sz w:val="19"/>
+              </w:rPr>
+              <w:t>30 min</w:t>
+            </w:r>
+          </w:p>
+        </w:tc>
+        <w:tc>
+          <w:tcPr>
+            <w:tcW w:type="dxa" w:w="6552"/>
+          </w:tcPr>
+          <w:p>
+            <w:r/>
+            <w:r>
+              <w:rPr>
+                <w:rFonts w:ascii="Arial" w:hAnsi="Arial"/>
+                <w:b w:val="0"/>
+                <w:sz w:val="19"/>
+              </w:rPr>
+              <w:t>Hands-on: Lab 12 (Optimisation, Reporting &amp; Safe Sharing): Optimise the Hiring Decision and Share Results Safely</w:t>
+            </w:r>
+          </w:p>
+        </w:tc>
+      </w:tr>
+      <w:tr>
+        <w:trPr>
+          <w:cantSplit/>
+        </w:trPr>
+        <w:tc>
+          <w:tcPr>
+            <w:tcW w:type="dxa" w:w="1584"/>
             <w:shd w:val="clear" w:color="auto" w:fill="F3F5F8"/>
           </w:tcPr>
           <w:p>
@@ -1539,13 +2603,13 @@
                 <w:b w:val="0"/>
                 <w:sz w:val="19"/>
               </w:rPr>
-              <w:t>18:15–18:30</w:t>
+              <w:t>18:20–18:30</w:t>
             </w:r>
           </w:p>
         </w:tc>
         <w:tc>
           <w:tcPr>
-            <w:tcW w:type="dxa" w:w="1296"/>
+            <w:tcW w:type="dxa" w:w="1224"/>
             <w:shd w:val="clear" w:color="auto" w:fill="F3F5F8"/>
           </w:tcPr>
           <w:p>
@@ -1556,13 +2620,13 @@
                 <w:b w:val="0"/>
                 <w:sz w:val="19"/>
               </w:rPr>
-              <w:t>15 min</w:t>
+              <w:t>10 min</w:t>
             </w:r>
           </w:p>
         </w:tc>
         <w:tc>
           <w:tcPr>
-            <w:tcW w:type="dxa" w:w="6840"/>
+            <w:tcW w:type="dxa" w:w="6552"/>
             <w:shd w:val="clear" w:color="auto" w:fill="F3F5F8"/>
           </w:tcPr>
           <w:p>
@@ -1573,7 +2637,7 @@
                 <w:b w:val="0"/>
                 <w:sz w:val="19"/>
               </w:rPr>
-              <w:t>Course wrap-up, your AI-in-Sheets checklist and next steps</w:t>
+              <w:t>Topic recaps mapped to LO1-LO3, your next steps and questions</w:t>
             </w:r>
           </w:p>
         </w:tc>
@@ -1592,6 +2656,7 @@
     <w:p>
       <w:pPr>
         <w:pStyle w:val="Heading1"/>
+        <w:keepNext/>
       </w:pPr>
       <w:r>
         <w:t>Lab Reference (aligned to course topics)</w:t>
@@ -1601,17 +2666,22 @@
       <w:tblPr>
         <w:tblStyle w:val="TableGrid"/>
         <w:tblW w:type="auto" w:w="0"/>
+        <w:tblLayout w:type="fixed"/>
         <w:tblLook w:firstColumn="1" w:firstRow="1" w:lastColumn="0" w:lastRow="0" w:noHBand="0" w:noVBand="1" w:val="04A0"/>
       </w:tblPr>
       <w:tblGrid>
-        <w:gridCol w:w="2880"/>
-        <w:gridCol w:w="2880"/>
-        <w:gridCol w:w="2880"/>
+        <w:gridCol w:w="4896"/>
+        <w:gridCol w:w="1872"/>
+        <w:gridCol w:w="2592"/>
       </w:tblGrid>
       <w:tr>
+        <w:trPr>
+          <w:tblHeader w:val="true"/>
+          <w:cantSplit/>
+        </w:trPr>
         <w:tc>
           <w:tcPr>
-            <w:tcW w:type="dxa" w:w="2880"/>
+            <w:tcW w:type="dxa" w:w="4896"/>
             <w:shd w:val="clear" w:color="auto" w:fill="1F6FEB"/>
           </w:tcPr>
           <w:p>
@@ -1629,7 +2699,7 @@
         </w:tc>
         <w:tc>
           <w:tcPr>
-            <w:tcW w:type="dxa" w:w="2880"/>
+            <w:tcW w:type="dxa" w:w="1872"/>
             <w:shd w:val="clear" w:color="auto" w:fill="1F6FEB"/>
           </w:tcPr>
           <w:p>
@@ -1647,7 +2717,7 @@
         </w:tc>
         <w:tc>
           <w:tcPr>
-            <w:tcW w:type="dxa" w:w="2880"/>
+            <w:tcW w:type="dxa" w:w="2592"/>
             <w:shd w:val="clear" w:color="auto" w:fill="1F6FEB"/>
           </w:tcPr>
           <w:p>
@@ -1665,9 +2735,12 @@
         </w:tc>
       </w:tr>
       <w:tr>
+        <w:trPr>
+          <w:cantSplit/>
+        </w:trPr>
         <w:tc>
           <w:tcPr>
-            <w:tcW w:type="dxa" w:w="2880"/>
+            <w:tcW w:type="dxa" w:w="4896"/>
             <w:shd w:val="clear" w:color="auto" w:fill="E8F0FE"/>
           </w:tcPr>
           <w:p>
@@ -1678,13 +2751,13 @@
                 <w:b/>
                 <w:sz w:val="19"/>
               </w:rPr>
-              <w:t>Topic 01: Getting Started with AI in Google Sheets</w:t>
+              <w:t>Topic 01: Fundamentals of Google Sheet</w:t>
             </w:r>
           </w:p>
         </w:tc>
         <w:tc>
           <w:tcPr>
-            <w:tcW w:type="dxa" w:w="2880"/>
+            <w:tcW w:type="dxa" w:w="1872"/>
             <w:shd w:val="clear" w:color="auto" w:fill="E8F0FE"/>
           </w:tcPr>
           <w:p>
@@ -1695,13 +2768,13 @@
                 <w:b w:val="0"/>
                 <w:sz w:val="19"/>
               </w:rPr>
-              <w:t>50%</w:t>
+              <w:t>Labs 1-4</w:t>
             </w:r>
           </w:p>
         </w:tc>
         <w:tc>
           <w:tcPr>
-            <w:tcW w:type="dxa" w:w="2880"/>
+            <w:tcW w:type="dxa" w:w="2592"/>
           </w:tcPr>
           <w:p>
             <w:r/>
@@ -1717,9 +2790,12 @@
         </w:tc>
       </w:tr>
       <w:tr>
+        <w:trPr>
+          <w:cantSplit/>
+        </w:trPr>
         <w:tc>
           <w:tcPr>
-            <w:tcW w:type="dxa" w:w="2880"/>
+            <w:tcW w:type="dxa" w:w="4896"/>
             <w:shd w:val="clear" w:color="auto" w:fill="E8F0FE"/>
           </w:tcPr>
           <w:p>
@@ -1730,13 +2806,13 @@
                 <w:b/>
                 <w:sz w:val="19"/>
               </w:rPr>
-              <w:t>Topic 02: Analysing and Automating Data with AI in Sheets</w:t>
+              <w:t>Topic 02: Data Analytics and Visualization</w:t>
             </w:r>
           </w:p>
         </w:tc>
         <w:tc>
           <w:tcPr>
-            <w:tcW w:type="dxa" w:w="2880"/>
+            <w:tcW w:type="dxa" w:w="1872"/>
             <w:shd w:val="clear" w:color="auto" w:fill="E8F0FE"/>
           </w:tcPr>
           <w:p>
@@ -1747,13 +2823,13 @@
                 <w:b w:val="0"/>
                 <w:sz w:val="19"/>
               </w:rPr>
-              <w:t>50%</w:t>
+              <w:t>Labs 5-8</w:t>
             </w:r>
           </w:p>
         </w:tc>
         <w:tc>
           <w:tcPr>
-            <w:tcW w:type="dxa" w:w="2880"/>
+            <w:tcW w:type="dxa" w:w="2592"/>
           </w:tcPr>
           <w:p>
             <w:r/>
@@ -1764,6 +2840,61 @@
                 <w:sz w:val="19"/>
               </w:rPr>
               <w:t>Lab 5, Lab 6, Lab 7, Lab 8</w:t>
+            </w:r>
+          </w:p>
+        </w:tc>
+      </w:tr>
+      <w:tr>
+        <w:trPr>
+          <w:cantSplit/>
+        </w:trPr>
+        <w:tc>
+          <w:tcPr>
+            <w:tcW w:type="dxa" w:w="4896"/>
+            <w:shd w:val="clear" w:color="auto" w:fill="E8F0FE"/>
+          </w:tcPr>
+          <w:p>
+            <w:r/>
+            <w:r>
+              <w:rPr>
+                <w:rFonts w:ascii="Arial" w:hAnsi="Arial"/>
+                <w:b/>
+                <w:sz w:val="19"/>
+              </w:rPr>
+              <w:t>Topic 03: Interactive Dashboard</w:t>
+            </w:r>
+          </w:p>
+        </w:tc>
+        <w:tc>
+          <w:tcPr>
+            <w:tcW w:type="dxa" w:w="1872"/>
+            <w:shd w:val="clear" w:color="auto" w:fill="E8F0FE"/>
+          </w:tcPr>
+          <w:p>
+            <w:r/>
+            <w:r>
+              <w:rPr>
+                <w:rFonts w:ascii="Arial" w:hAnsi="Arial"/>
+                <w:b w:val="0"/>
+                <w:sz w:val="19"/>
+              </w:rPr>
+              <w:t>Labs 9-12</w:t>
+            </w:r>
+          </w:p>
+        </w:tc>
+        <w:tc>
+          <w:tcPr>
+            <w:tcW w:type="dxa" w:w="2592"/>
+          </w:tcPr>
+          <w:p>
+            <w:r/>
+            <w:r>
+              <w:rPr>
+                <w:rFonts w:ascii="Arial" w:hAnsi="Arial"/>
+                <w:b w:val="0"/>
+                <w:sz w:val="19"/>
+              </w:rPr>
+              <w:t>Lab 9, Lab 10, Lab 11, Lab 12</w:t>
             </w:r>
           </w:p>
         </w:tc>

</xml_diff>